<commit_message>
feat: add 'modelo-termo-recebimento' in 'modelo-docs' folder
</commit_message>
<xml_diff>
--- a/modelos-docs/modelo-termo-recebimento.docx
+++ b/modelos-docs/modelo-termo-recebimento.docx
@@ -85,31 +85,47 @@
           <w:sz w:val="24"/>
           <w:szCs w:val="24"/>
         </w:rPr>
-        <w:t>XX</w:t>
-      </w:r>
-      <w:r>
-        <w:rPr>
-          <w:rFonts w:ascii="Times New Roman" w:hAnsi="Times New Roman" w:cs="Times New Roman"/>
-          <w:sz w:val="24"/>
-          <w:szCs w:val="24"/>
-        </w:rPr>
-        <w:t xml:space="preserve"> de </w:t>
-      </w:r>
-      <w:r>
-        <w:rPr>
-          <w:rFonts w:ascii="Times New Roman" w:hAnsi="Times New Roman" w:cs="Times New Roman"/>
-          <w:sz w:val="24"/>
-          <w:szCs w:val="24"/>
-        </w:rPr>
-        <w:t>XX</w:t>
-      </w:r>
-      <w:r>
-        <w:rPr>
-          <w:rFonts w:ascii="Times New Roman" w:hAnsi="Times New Roman" w:cs="Times New Roman"/>
-          <w:sz w:val="24"/>
-          <w:szCs w:val="24"/>
-        </w:rPr>
-        <w:t xml:space="preserve"> de 2024 a </w:t>
+        <w:t xml:space="preserve">_____ </w:t>
+      </w:r>
+      <w:r>
+        <w:rPr>
+          <w:rFonts w:ascii="Times New Roman" w:hAnsi="Times New Roman" w:cs="Times New Roman"/>
+          <w:sz w:val="24"/>
+          <w:szCs w:val="24"/>
+        </w:rPr>
+        <w:t xml:space="preserve">de </w:t>
+      </w:r>
+      <w:r>
+        <w:rPr>
+          <w:rFonts w:ascii="Times New Roman" w:hAnsi="Times New Roman" w:cs="Times New Roman"/>
+          <w:sz w:val="24"/>
+          <w:szCs w:val="24"/>
+        </w:rPr>
+        <w:t xml:space="preserve">___________ </w:t>
+      </w:r>
+      <w:r>
+        <w:rPr>
+          <w:rFonts w:ascii="Times New Roman" w:hAnsi="Times New Roman" w:cs="Times New Roman"/>
+          <w:sz w:val="24"/>
+          <w:szCs w:val="24"/>
+        </w:rPr>
+        <w:t xml:space="preserve">de </w:t>
+      </w:r>
+      <w:r>
+        <w:rPr>
+          <w:rFonts w:ascii="Times New Roman" w:hAnsi="Times New Roman" w:cs="Times New Roman"/>
+          <w:sz w:val="24"/>
+          <w:szCs w:val="24"/>
+        </w:rPr>
+        <w:t>______</w:t>
+      </w:r>
+      <w:r>
+        <w:rPr>
+          <w:rFonts w:ascii="Times New Roman" w:hAnsi="Times New Roman" w:cs="Times New Roman"/>
+          <w:sz w:val="24"/>
+          <w:szCs w:val="24"/>
+        </w:rPr>
+        <w:t xml:space="preserve"> a </w:t>
       </w:r>
       <w:r>
         <w:rPr>
@@ -127,7 +143,55 @@
           <w:sz w:val="24"/>
           <w:szCs w:val="24"/>
         </w:rPr>
-        <w:t xml:space="preserve">, sediada na Rua Capitão Antônio Leite, 65 - Coremas/PB, CEP 58.770- 000 inscrita no CNPJ sob o nº 08.939.936/0001-94 neste ato representado pelo Prefeito Constitucional o Sr. Iranir Alexandrino da Silva, portador da Cédula de Identidade RG nº 38.162.658 e do CPF nº 136.183.728-41 e pelo Engenheiro Fiscal Municipal o Sr. Fernando Matias Mamede portador do CREA/PB nº 11466382021, </w:t>
+        <w:t>, sediada na Rua Capitão Antônio Leite, 65 - Coremas/PB, CEP 58.770- 000 inscrita no CNPJ sob o nº 08.939.936/0001-94 neste ato representado pelo Prefeito Constitucional o Sr.</w:t>
+      </w:r>
+      <w:r>
+        <w:rPr>
+          <w:rFonts w:ascii="Times New Roman" w:hAnsi="Times New Roman" w:cs="Times New Roman"/>
+          <w:sz w:val="24"/>
+          <w:szCs w:val="24"/>
+        </w:rPr>
+        <w:t xml:space="preserve"> Edilson Pereira de Oliveira</w:t>
+      </w:r>
+      <w:r>
+        <w:rPr>
+          <w:rFonts w:ascii="Times New Roman" w:hAnsi="Times New Roman" w:cs="Times New Roman"/>
+          <w:sz w:val="24"/>
+          <w:szCs w:val="24"/>
+        </w:rPr>
+        <w:t xml:space="preserve">, portador da Cédula de Identidade RG nº </w:t>
+      </w:r>
+      <w:r>
+        <w:rPr>
+          <w:rFonts w:ascii="Times New Roman" w:hAnsi="Times New Roman" w:cs="Times New Roman"/>
+          <w:sz w:val="24"/>
+          <w:szCs w:val="24"/>
+        </w:rPr>
+        <w:t>295.663</w:t>
+      </w:r>
+      <w:r>
+        <w:rPr>
+          <w:rFonts w:ascii="Times New Roman" w:hAnsi="Times New Roman" w:cs="Times New Roman"/>
+          <w:sz w:val="24"/>
+          <w:szCs w:val="24"/>
+        </w:rPr>
+        <w:t xml:space="preserve"> e do CPF nº </w:t>
+      </w:r>
+      <w:r>
+        <w:rPr>
+          <w:rFonts w:ascii="Times New Roman" w:hAnsi="Times New Roman" w:cs="Times New Roman"/>
+          <w:sz w:val="24"/>
+          <w:szCs w:val="24"/>
+        </w:rPr>
+        <w:t>141.183.004-00</w:t>
+      </w:r>
+      <w:r>
+        <w:rPr>
+          <w:rFonts w:ascii="Times New Roman" w:hAnsi="Times New Roman" w:cs="Times New Roman"/>
+          <w:sz w:val="24"/>
+          <w:szCs w:val="24"/>
+        </w:rPr>
+        <w:t xml:space="preserve"> e pelo Engenheiro Fiscal Municipal o Sr. Fernando Matias Mamede portador do CREA/PB nº 11466382021, </w:t>
       </w:r>
       <w:r>
         <w:rPr>
@@ -428,7 +492,47 @@
           <w:sz w:val="24"/>
           <w:szCs w:val="24"/>
         </w:rPr>
-        <w:t>Coremas/PB, XX de XX de 2024</w:t>
+        <w:t xml:space="preserve">Coremas/PB, </w:t>
+      </w:r>
+      <w:r>
+        <w:rPr>
+          <w:rFonts w:ascii="Times New Roman" w:hAnsi="Times New Roman" w:cs="Times New Roman"/>
+          <w:sz w:val="24"/>
+          <w:szCs w:val="24"/>
+        </w:rPr>
+        <w:t>____</w:t>
+      </w:r>
+      <w:r>
+        <w:rPr>
+          <w:rFonts w:ascii="Times New Roman" w:hAnsi="Times New Roman" w:cs="Times New Roman"/>
+          <w:sz w:val="24"/>
+          <w:szCs w:val="24"/>
+        </w:rPr>
+        <w:t xml:space="preserve"> de </w:t>
+      </w:r>
+      <w:r>
+        <w:rPr>
+          <w:rFonts w:ascii="Times New Roman" w:hAnsi="Times New Roman" w:cs="Times New Roman"/>
+          <w:sz w:val="24"/>
+          <w:szCs w:val="24"/>
+        </w:rPr>
+        <w:t>___________</w:t>
+      </w:r>
+      <w:r>
+        <w:rPr>
+          <w:rFonts w:ascii="Times New Roman" w:hAnsi="Times New Roman" w:cs="Times New Roman"/>
+          <w:sz w:val="24"/>
+          <w:szCs w:val="24"/>
+        </w:rPr>
+        <w:t xml:space="preserve"> de </w:t>
+      </w:r>
+      <w:r>
+        <w:rPr>
+          <w:rFonts w:ascii="Times New Roman" w:hAnsi="Times New Roman" w:cs="Times New Roman"/>
+          <w:sz w:val="24"/>
+          <w:szCs w:val="24"/>
+        </w:rPr>
+        <w:t>_____.</w:t>
       </w:r>
     </w:p>
     <w:p>
@@ -561,7 +665,7 @@
                 <w:b/>
                 <w:bCs/>
               </w:rPr>
-              <w:t>Iranir Alexandrino da Silva</w:t>
+              <w:t>Edilson Pereira de Oliveira</w:t>
             </w:r>
           </w:p>
         </w:tc>
@@ -644,7 +748,13 @@
               <w:rPr>
                 <w:rFonts w:ascii="Times New Roman" w:hAnsi="Times New Roman" w:cs="Times New Roman"/>
               </w:rPr>
-              <w:t>RG nº 38.162.658</w:t>
+              <w:t xml:space="preserve">RG nº </w:t>
+            </w:r>
+            <w:r>
+              <w:rPr>
+                <w:rFonts w:ascii="Times New Roman" w:hAnsi="Times New Roman" w:cs="Times New Roman"/>
+              </w:rPr>
+              <w:t>295.663</w:t>
             </w:r>
           </w:p>
           <w:p>
@@ -658,7 +768,13 @@
               <w:rPr>
                 <w:rFonts w:ascii="Times New Roman" w:hAnsi="Times New Roman" w:cs="Times New Roman"/>
               </w:rPr>
-              <w:t>CPF nº 136.183.728-41</w:t>
+              <w:t xml:space="preserve">CPF nº </w:t>
+            </w:r>
+            <w:r>
+              <w:rPr>
+                <w:rFonts w:ascii="Times New Roman" w:hAnsi="Times New Roman" w:cs="Times New Roman"/>
+              </w:rPr>
+              <w:t>141.183.004-00</w:t>
             </w:r>
           </w:p>
         </w:tc>

</xml_diff>